<commit_message>
Atualizei o documento "Visão"
Editei funcionalidades do Administrador no sistema
</commit_message>
<xml_diff>
--- a/GELO/1.Requisitos/Visão.docx
+++ b/GELO/1.Requisitos/Visão.docx
@@ -66,8 +66,6 @@
           </wp:inline>
         </w:drawing>
       </w:r>
-      <w:bookmarkStart w:id="0" w:name="_GoBack"/>
-      <w:bookmarkEnd w:id="0"/>
     </w:p>
     <w:p/>
     <w:p>
@@ -462,6 +460,9 @@
             <w:pPr>
               <w:jc w:val="left"/>
             </w:pPr>
+            <w:r>
+              <w:t>14/09/2026</w:t>
+            </w:r>
           </w:p>
         </w:tc>
         <w:tc>
@@ -478,6 +479,9 @@
             <w:pPr>
               <w:jc w:val="left"/>
             </w:pPr>
+            <w:r>
+              <w:t>1.0.1</w:t>
+            </w:r>
           </w:p>
         </w:tc>
         <w:tc>
@@ -494,6 +498,9 @@
             <w:pPr>
               <w:jc w:val="left"/>
             </w:pPr>
+            <w:r>
+              <w:t>Atualização do documento com novas informações e funcionalidades</w:t>
+            </w:r>
           </w:p>
         </w:tc>
         <w:tc>
@@ -510,6 +517,9 @@
             <w:pPr>
               <w:jc w:val="left"/>
             </w:pPr>
+            <w:r>
+              <w:t>Maria Luiza Medina Fonseca</w:t>
+            </w:r>
           </w:p>
         </w:tc>
       </w:tr>
@@ -1073,8 +1083,8 @@
           <w:szCs w:val="28"/>
         </w:rPr>
       </w:pPr>
-      <w:bookmarkStart w:id="1" w:name="_jntg37lpg0yd"/>
-      <w:bookmarkEnd w:id="1"/>
+      <w:bookmarkStart w:id="0" w:name="_jntg37lpg0yd"/>
+      <w:bookmarkEnd w:id="0"/>
       <w:r>
         <w:rPr>
           <w:sz w:val="28"/>
@@ -1092,8 +1102,8 @@
           <w:numId w:val="2"/>
         </w:numPr>
       </w:pPr>
-      <w:bookmarkStart w:id="2" w:name="_f5dkxt7mlpi0"/>
-      <w:bookmarkEnd w:id="2"/>
+      <w:bookmarkStart w:id="1" w:name="_f5dkxt7mlpi0"/>
+      <w:bookmarkEnd w:id="1"/>
       <w:r>
         <w:t>Resumo do Negócio</w:t>
       </w:r>
@@ -1120,8 +1130,8 @@
           <w:numId w:val="2"/>
         </w:numPr>
       </w:pPr>
-      <w:bookmarkStart w:id="3" w:name="_i0nah3vxehks"/>
-      <w:bookmarkEnd w:id="3"/>
+      <w:bookmarkStart w:id="2" w:name="_i0nah3vxehks"/>
+      <w:bookmarkEnd w:id="2"/>
       <w:r>
         <w:t>Objetivo do Sistema</w:t>
       </w:r>
@@ -1143,8 +1153,8 @@
           <w:numId w:val="2"/>
         </w:numPr>
       </w:pPr>
-      <w:bookmarkStart w:id="4" w:name="_85z5r3f91nxh"/>
-      <w:bookmarkEnd w:id="4"/>
+      <w:bookmarkStart w:id="3" w:name="_85z5r3f91nxh"/>
+      <w:bookmarkEnd w:id="3"/>
       <w:r>
         <w:t>Glossário</w:t>
       </w:r>
@@ -1168,7 +1178,13 @@
         <w:jc w:val="left"/>
       </w:pPr>
       <w:r>
-        <w:t>Uma classificação geral de 1 a 5;</w:t>
+        <w:t>Uma classificação geral</w:t>
+      </w:r>
+      <w:r>
+        <w:t xml:space="preserve"> do livro</w:t>
+      </w:r>
+      <w:r>
+        <w:t xml:space="preserve"> de 1 a 5;</w:t>
       </w:r>
     </w:p>
     <w:p>
@@ -1192,8 +1208,8 @@
           <w:numId w:val="2"/>
         </w:numPr>
       </w:pPr>
-      <w:bookmarkStart w:id="5" w:name="_fc294wr5a3iw"/>
-      <w:bookmarkEnd w:id="5"/>
+      <w:bookmarkStart w:id="4" w:name="_fc294wr5a3iw"/>
+      <w:bookmarkEnd w:id="4"/>
       <w:r>
         <w:t>Referências</w:t>
       </w:r>
@@ -1222,8 +1238,8 @@
           <w:numId w:val="1"/>
         </w:numPr>
       </w:pPr>
-      <w:bookmarkStart w:id="6" w:name="_wqzhrmumr5q6"/>
-      <w:bookmarkEnd w:id="6"/>
+      <w:bookmarkStart w:id="5" w:name="_wqzhrmumr5q6"/>
+      <w:bookmarkEnd w:id="5"/>
       <w:r>
         <w:lastRenderedPageBreak/>
         <w:t>Problema</w:t>
@@ -1630,8 +1646,8 @@
           <w:numId w:val="1"/>
         </w:numPr>
       </w:pPr>
-      <w:bookmarkStart w:id="7" w:name="_ir1wgwtojjjq"/>
-      <w:bookmarkEnd w:id="7"/>
+      <w:bookmarkStart w:id="6" w:name="_ir1wgwtojjjq"/>
+      <w:bookmarkEnd w:id="6"/>
       <w:r>
         <w:t>Usuários</w:t>
       </w:r>
@@ -1795,7 +1811,15 @@
               <w:jc w:val="left"/>
             </w:pPr>
             <w:r>
-              <w:t>Gerenciar o cadastro de novos livros, moderar análises de livros e contas de usuários.</w:t>
+              <w:t xml:space="preserve">Gerenciar </w:t>
+            </w:r>
+            <w:r>
+              <w:t>e  modera</w:t>
+            </w:r>
+            <w:bookmarkStart w:id="7" w:name="_GoBack"/>
+            <w:bookmarkEnd w:id="7"/>
+            <w:r>
+              <w:t xml:space="preserve"> análises de livros e contas de usuários.</w:t>
             </w:r>
           </w:p>
         </w:tc>
@@ -1896,15 +1920,7 @@
         <w:jc w:val="left"/>
       </w:pPr>
       <w:r>
-        <w:t xml:space="preserve">Deve utilizar o ecossistema Spring (Spring Data JPA / </w:t>
-      </w:r>
-      <w:proofErr w:type="spellStart"/>
-      <w:r>
-        <w:t>Hibernate</w:t>
-      </w:r>
-      <w:proofErr w:type="spellEnd"/>
-      <w:r>
-        <w:t>) para persistência e mapeamento de dados em um banco relacional;</w:t>
+        <w:t>Deve utilizar o ecossistema Spring (Spring Data JPA / Hibernate) para persistência e mapeamento de dados em um banco relacional;</w:t>
       </w:r>
     </w:p>
     <w:p>
@@ -1916,15 +1932,7 @@
         <w:jc w:val="left"/>
       </w:pPr>
       <w:r>
-        <w:t>Deve rodar em qualquer sistema operacional através de um container web/</w:t>
-      </w:r>
-      <w:proofErr w:type="spellStart"/>
-      <w:r>
-        <w:t>servlet</w:t>
-      </w:r>
-      <w:proofErr w:type="spellEnd"/>
-      <w:r>
-        <w:t xml:space="preserve"> compatível com a JVM e a integração Spring-JSF;</w:t>
+        <w:t>Deve rodar em qualquer sistema operacional através de um container web/servlet compatível com a JVM e a integração Spring-JSF;</w:t>
       </w:r>
     </w:p>
     <w:p>
@@ -1936,15 +1944,7 @@
         <w:jc w:val="left"/>
       </w:pPr>
       <w:r>
-        <w:t xml:space="preserve">O acesso ao sistema deve exigir controle de autenticação e autorização, diferenciando as permissões dos perfis </w:t>
-      </w:r>
-      <w:proofErr w:type="spellStart"/>
-      <w:r>
-        <w:t>Admin</w:t>
-      </w:r>
-      <w:proofErr w:type="spellEnd"/>
-      <w:r>
-        <w:t xml:space="preserve"> e Usuário;</w:t>
+        <w:t>O acesso ao sistema deve exigir controle de autenticação e autorização, diferenciando as permissões dos perfis Admin e Usuário;</w:t>
       </w:r>
     </w:p>
     <w:p>
@@ -1968,15 +1968,7 @@
         <w:jc w:val="left"/>
       </w:pPr>
       <w:r>
-        <w:t xml:space="preserve">O projeto deve ser desenvolvido e entregue até </w:t>
-      </w:r>
-      <w:proofErr w:type="gramStart"/>
-      <w:r>
-        <w:t>Dezembro</w:t>
-      </w:r>
-      <w:proofErr w:type="gramEnd"/>
-      <w:r>
-        <w:t>.</w:t>
+        <w:t>O projeto deve ser desenvolvido e entregue até Dezembro.</w:t>
       </w:r>
     </w:p>
     <w:p>
@@ -2267,14 +2259,27 @@
           <w:r>
             <w:t xml:space="preserve"> de </w:t>
           </w:r>
-          <w:fldSimple w:instr=" NUMPAGES ">
-            <w:r>
-              <w:rPr>
-                <w:noProof/>
-              </w:rPr>
-              <w:t>6</w:t>
-            </w:r>
-          </w:fldSimple>
+          <w:r>
+            <w:fldChar w:fldCharType="begin"/>
+          </w:r>
+          <w:r>
+            <w:instrText xml:space="preserve"> NUMPAGES </w:instrText>
+          </w:r>
+          <w:r>
+            <w:fldChar w:fldCharType="separate"/>
+          </w:r>
+          <w:r>
+            <w:rPr>
+              <w:noProof/>
+            </w:rPr>
+            <w:t>6</w:t>
+          </w:r>
+          <w:r>
+            <w:rPr>
+              <w:noProof/>
+            </w:rPr>
+            <w:fldChar w:fldCharType="end"/>
+          </w:r>
         </w:p>
       </w:tc>
     </w:tr>
@@ -2283,13 +2288,8 @@
     <w:pPr>
       <w:jc w:val="right"/>
     </w:pPr>
-    <w:proofErr w:type="spellStart"/>
     <w:r>
-      <w:t>vs</w:t>
-    </w:r>
-    <w:proofErr w:type="spellEnd"/>
-    <w:r>
-      <w:t xml:space="preserve">: </w:t>
+      <w:t xml:space="preserve">vs: </w:t>
     </w:r>
     <w:r>
       <w:fldChar w:fldCharType="begin"/>

</xml_diff>